<commit_message>
Auto commit (2026-10-28 10:44) — 2 changes
Claude Code 세션 종료 시 자동 커밋.

Co-Authored-By: Claude <noreply@anthropic.com>
Claude-Session: https://claude.ai/code/52d1c2c9-8188-4640-b61c-a7aee210702f
</commit_message>
<xml_diff>
--- a/projects/36_slave_dragon_king/노예라 불린 용의 공주 · 그가 버린 흑발의 연인_대사·오류 정리(10.28).docx
+++ b/projects/36_slave_dragon_king/노예라 불린 용의 공주 · 그가 버린 흑발의 연인_대사·오류 정리(10.28).docx
@@ -50,6 +50,146 @@
     </w:p>
     <w:p>
       <w:pPr>
+        <w:spacing w:before="0" w:after="100" w:line="312" w:lineRule="auto"/>
+      </w:pPr>
+      <w:r>
+        <w:rPr>
+          <w:rFonts w:ascii="맑은 고딕" w:hAnsi="맑은 고딕" w:eastAsia="맑은 고딕"/>
+          <w:b w:val="0"/>
+          <w:color w:val="1A1A1A"/>
+          <w:sz w:val="21"/>
+        </w:rPr>
+        <w:t xml:space="preserve">용어: </w:t>
+      </w:r>
+      <w:r>
+        <w:rPr>
+          <w:rFonts w:ascii="맑은 고딕" w:hAnsi="맑은 고딕" w:eastAsia="맑은 고딕"/>
+          <w:b/>
+          <w:color w:val="1A1A1A"/>
+          <w:sz w:val="21"/>
+        </w:rPr>
+        <w:t>10.22 원고 · 10.27 원고</w:t>
+      </w:r>
+      <w:r>
+        <w:rPr>
+          <w:rFonts w:ascii="맑은 고딕" w:hAnsi="맑은 고딕" w:eastAsia="맑은 고딕"/>
+          <w:b w:val="0"/>
+          <w:color w:val="1A1A1A"/>
+          <w:sz w:val="21"/>
+        </w:rPr>
+        <w:t xml:space="preserve"> = 용의 공주 10월 22일·27일 작가 원고 · </w:t>
+      </w:r>
+      <w:r>
+        <w:rPr>
+          <w:rFonts w:ascii="맑은 고딕" w:hAnsi="맑은 고딕" w:eastAsia="맑은 고딕"/>
+          <w:b/>
+          <w:color w:val="1A1A1A"/>
+          <w:sz w:val="21"/>
+        </w:rPr>
+        <w:t>10-23 요청</w:t>
+      </w:r>
+      <w:r>
+        <w:rPr>
+          <w:rFonts w:ascii="맑은 고딕" w:hAnsi="맑은 고딕" w:eastAsia="맑은 고딕"/>
+          <w:b w:val="0"/>
+          <w:color w:val="1A1A1A"/>
+          <w:sz w:val="21"/>
+        </w:rPr>
+        <w:t xml:space="preserve"> = 10월 23일 작가에게 보낸 수정 요청 · </w:t>
+      </w:r>
+      <w:r>
+        <w:rPr>
+          <w:rFonts w:ascii="맑은 고딕" w:hAnsi="맑은 고딕" w:eastAsia="맑은 고딕"/>
+          <w:b/>
+          <w:color w:val="1A1A1A"/>
+          <w:sz w:val="21"/>
+        </w:rPr>
+        <w:t>헤더</w:t>
+      </w:r>
+      <w:r>
+        <w:rPr>
+          <w:rFonts w:ascii="맑은 고딕" w:hAnsi="맑은 고딕" w:eastAsia="맑은 고딕"/>
+          <w:b w:val="0"/>
+          <w:color w:val="1A1A1A"/>
+          <w:sz w:val="21"/>
+        </w:rPr>
+        <w:t xml:space="preserve"> = 씬 첫 줄(번호/장소/낮밤/내·외) · </w:t>
+      </w:r>
+      <w:r>
+        <w:rPr>
+          <w:rFonts w:ascii="맑은 고딕" w:hAnsi="맑은 고딕" w:eastAsia="맑은 고딕"/>
+          <w:b/>
+          <w:color w:val="1A1A1A"/>
+          <w:sz w:val="21"/>
+        </w:rPr>
+        <w:t>△</w:t>
+      </w:r>
+      <w:r>
+        <w:rPr>
+          <w:rFonts w:ascii="맑은 고딕" w:hAnsi="맑은 고딕" w:eastAsia="맑은 고딕"/>
+          <w:b w:val="0"/>
+          <w:color w:val="1A1A1A"/>
+          <w:sz w:val="21"/>
+        </w:rPr>
+        <w:t xml:space="preserve"> = 지문(화면 묘사) 표시 · </w:t>
+      </w:r>
+      <w:r>
+        <w:rPr>
+          <w:rFonts w:ascii="맑은 고딕" w:hAnsi="맑은 고딕" w:eastAsia="맑은 고딕"/>
+          <w:b/>
+          <w:color w:val="1A1A1A"/>
+          <w:sz w:val="21"/>
+        </w:rPr>
+        <w:t>인물 줄</w:t>
+      </w:r>
+      <w:r>
+        <w:rPr>
+          <w:rFonts w:ascii="맑은 고딕" w:hAnsi="맑은 고딕" w:eastAsia="맑은 고딕"/>
+          <w:b w:val="0"/>
+          <w:color w:val="1A1A1A"/>
+          <w:sz w:val="21"/>
+        </w:rPr>
+        <w:t xml:space="preserve"> = 헤더 아래 등장인물 목록(人物·角色) · </w:t>
+      </w:r>
+      <w:r>
+        <w:rPr>
+          <w:rFonts w:ascii="맑은 고딕" w:hAnsi="맑은 고딕" w:eastAsia="맑은 고딕"/>
+          <w:b/>
+          <w:color w:val="1A1A1A"/>
+          <w:sz w:val="21"/>
+        </w:rPr>
+        <w:t>VO</w:t>
+      </w:r>
+      <w:r>
+        <w:rPr>
+          <w:rFonts w:ascii="맑은 고딕" w:hAnsi="맑은 고딕" w:eastAsia="맑은 고딕"/>
+          <w:b w:val="0"/>
+          <w:color w:val="1A1A1A"/>
+          <w:sz w:val="21"/>
+        </w:rPr>
+        <w:t xml:space="preserve"> = 속마음 대사 · </w:t>
+      </w:r>
+      <w:r>
+        <w:rPr>
+          <w:rFonts w:ascii="맑은 고딕" w:hAnsi="맑은 고딕" w:eastAsia="맑은 고딕"/>
+          <w:b/>
+          <w:color w:val="1A1A1A"/>
+          <w:sz w:val="21"/>
+        </w:rPr>
+        <w:t>결속</w:t>
+      </w:r>
+      <w:r>
+        <w:rPr>
+          <w:rFonts w:ascii="맑은 고딕" w:hAnsi="맑은 고딕" w:eastAsia="맑은 고딕"/>
+          <w:b w:val="0"/>
+          <w:color w:val="1A1A1A"/>
+          <w:sz w:val="21"/>
+        </w:rPr>
+        <w:t xml:space="preserve"> = 흑발에서 올리비아와 데미안이 손바닥 덩굴 문양으로 맺은 서약(14화에 완전히 끊김).</w:t>
+      </w:r>
+    </w:p>
+    <w:p>
+      <w:pPr>
         <w:spacing w:before="280" w:after="80" w:line="312" w:lineRule="auto"/>
       </w:pPr>
       <w:r>
@@ -88,7 +228,7 @@
           <w:color w:val="1A1A1A"/>
           <w:sz w:val="21"/>
         </w:rPr>
-        <w:t>· 무료 1~9화 대사 한 줄이 평균 21.2자다. 흑발 1~9화는 16.9자, 비교 원고(늑대 후계자의 세쌍둥이 1016 최종고 · 분량 문제없다고 확인된 원고) 1~9화는 17.3자. 같은 무료 구간에서 한 줄이 4자쯤 길다.</w:t>
+        <w:t>· 무료 1~9화 대사 한 줄이 평균 21.2자다. 흑발 1~9화는 16.9자, 비교 원고(늑대 후계자의 세쌍둥이 작가 최종고 · 분량 문제없다고 확인된 원고) 1~9화는 17.3자. 같은 무료 구간에서 한 줄이 4자쯤 길다.</w:t>
       </w:r>
     </w:p>
     <w:p>
@@ -118,7 +258,7 @@
           <w:color w:val="1A1A1A"/>
           <w:sz w:val="21"/>
         </w:rPr>
-        <w:t>· 말이 높다. 맹세·설교·법정 말투(不朽誓约 · 王者的心要装得下所有的子民 · 企图刺杀本公主).</w:t>
+        <w:t>· 말투가 맹세·설교·고발문처럼 딱딱하고 어렵다(不朽誓约 · 王者的心要装得下所有的子民 · 企图刺杀本公主).</w:t>
       </w:r>
     </w:p>
     <w:p>
@@ -156,7 +296,7 @@
           <w:color w:val="1A1A1A"/>
           <w:sz w:val="21"/>
         </w:rPr>
-        <w:t>(한 줄 21.2자, 비교 원고 같은 구간 19.0자). 길어지는 모양이 다르다.</w:t>
+        <w:t>(한 줄 21.2자, 비교 원고 같은 구간 19.0자). 길어지는 이유가 용의 공주와 다르다.</w:t>
       </w:r>
     </w:p>
     <w:p>
@@ -939,9 +1079,9 @@
       <w:tblGrid>
         <w:gridCol w:w="454"/>
         <w:gridCol w:w="1814"/>
-        <w:gridCol w:w="5095"/>
-        <w:gridCol w:w="2841"/>
-        <w:gridCol w:w="4820"/>
+        <w:gridCol w:w="5079"/>
+        <w:gridCol w:w="2872"/>
+        <w:gridCol w:w="4806"/>
       </w:tblGrid>
       <w:tr>
         <w:tc>
@@ -986,7 +1126,7 @@
         </w:tc>
         <w:tc>
           <w:tcPr>
-            <w:tcW w:type="dxa" w:w="5095"/>
+            <w:tcW w:type="dxa" w:w="5079"/>
             <w:shd w:val="clear" w:color="auto" w:fill="EFE6D2"/>
           </w:tcPr>
           <w:p>
@@ -1006,7 +1146,7 @@
         </w:tc>
         <w:tc>
           <w:tcPr>
-            <w:tcW w:type="dxa" w:w="2841"/>
+            <w:tcW w:type="dxa" w:w="2872"/>
             <w:shd w:val="clear" w:color="auto" w:fill="EFE6D2"/>
           </w:tcPr>
           <w:p>
@@ -1026,7 +1166,7 @@
         </w:tc>
         <w:tc>
           <w:tcPr>
-            <w:tcW w:type="dxa" w:w="4820"/>
+            <w:tcW w:type="dxa" w:w="4806"/>
             <w:shd w:val="clear" w:color="auto" w:fill="EFE6D2"/>
           </w:tcPr>
           <w:p>
@@ -1086,7 +1226,7 @@
         </w:tc>
         <w:tc>
           <w:tcPr>
-            <w:tcW w:type="dxa" w:w="5095"/>
+            <w:tcW w:type="dxa" w:w="5079"/>
           </w:tcPr>
           <w:p>
             <w:pPr>
@@ -1133,7 +1273,7 @@
         </w:tc>
         <w:tc>
           <w:tcPr>
-            <w:tcW w:type="dxa" w:w="2841"/>
+            <w:tcW w:type="dxa" w:w="2872"/>
           </w:tcPr>
           <w:p>
             <w:pPr>
@@ -1146,13 +1286,13 @@
                 <w:color w:val="1A1A1A"/>
                 <w:sz w:val="19"/>
               </w:rPr>
-              <w:t>한 방에서 두 화에 걸쳐 오빠 셋이 바네사를 띄우고 달래는 대사가 10줄이다. 에드워드 첫 줄은 1화 맹세를 다시 말한다(시청자는 1화에서 봤다). 세바스찬의 "핏줄을 매개로 목숨 걸고 각성" 약속은 9화까지 다시 안 나오고, "以自身血脉为引"은 말도 어렵다.</w:t>
+              <w:t>한 방에서 두 화에 걸쳐 오빠 셋이 바네사를 추켜세우고 달래는 대사가 10줄이다. 에드워드 첫 줄은 1화 맹세를 다시 말한다(시청자는 1화에서 봤다). 세바스찬의 "핏줄을 매개로 목숨 걸고 각성" 약속은 9화까지 다시 안 나오고, "以自身血脉为引"은 말도 어렵다.</w:t>
             </w:r>
           </w:p>
         </w:tc>
         <w:tc>
           <w:tcPr>
-            <w:tcW w:type="dxa" w:w="4820"/>
+            <w:tcW w:type="dxa" w:w="4806"/>
           </w:tcPr>
           <w:p>
             <w:pPr>
@@ -1179,7 +1319,7 @@
                 <w:color w:val="1A1A1A"/>
                 <w:sz w:val="19"/>
               </w:rPr>
-              <w:t>남는 정보(오늘 성인식·혈통 의식 / 반지가 또 거부 / 반란 탓이라는 오빠 말 / 축제 절정에 여왕 발표)는 그대로 있다.</w:t>
+              <w:t>남는 정보(오늘 성인식·혈통 의식 / 반지가 또 바네사를 거부 / 반란 탓이라는 오빠 말 / 축제 절정에 여왕 발표)는 그대로 있다.</w:t>
             </w:r>
           </w:p>
         </w:tc>
@@ -1225,7 +1365,7 @@
         </w:tc>
         <w:tc>
           <w:tcPr>
-            <w:tcW w:type="dxa" w:w="5095"/>
+            <w:tcW w:type="dxa" w:w="5079"/>
           </w:tcPr>
           <w:p>
             <w:pPr>
@@ -1272,7 +1412,7 @@
         </w:tc>
         <w:tc>
           <w:tcPr>
-            <w:tcW w:type="dxa" w:w="2841"/>
+            <w:tcW w:type="dxa" w:w="2872"/>
           </w:tcPr>
           <w:p>
             <w:pPr>
@@ -1291,7 +1431,7 @@
         </w:tc>
         <w:tc>
           <w:tcPr>
-            <w:tcW w:type="dxa" w:w="4820"/>
+            <w:tcW w:type="dxa" w:w="4806"/>
           </w:tcPr>
           <w:p>
             <w:pPr>
@@ -1378,7 +1518,7 @@
         </w:tc>
         <w:tc>
           <w:tcPr>
-            <w:tcW w:type="dxa" w:w="5095"/>
+            <w:tcW w:type="dxa" w:w="5079"/>
           </w:tcPr>
           <w:p>
             <w:pPr>
@@ -1425,7 +1565,7 @@
         </w:tc>
         <w:tc>
           <w:tcPr>
-            <w:tcW w:type="dxa" w:w="2841"/>
+            <w:tcW w:type="dxa" w:w="2872"/>
           </w:tcPr>
           <w:p>
             <w:pPr>
@@ -1444,7 +1584,7 @@
         </w:tc>
         <w:tc>
           <w:tcPr>
-            <w:tcW w:type="dxa" w:w="4820"/>
+            <w:tcW w:type="dxa" w:w="4806"/>
           </w:tcPr>
           <w:p>
             <w:pPr>
@@ -1545,7 +1685,7 @@
         </w:tc>
         <w:tc>
           <w:tcPr>
-            <w:tcW w:type="dxa" w:w="5095"/>
+            <w:tcW w:type="dxa" w:w="5079"/>
           </w:tcPr>
           <w:p>
             <w:pPr>
@@ -1578,7 +1718,7 @@
         </w:tc>
         <w:tc>
           <w:tcPr>
-            <w:tcW w:type="dxa" w:w="2841"/>
+            <w:tcW w:type="dxa" w:w="2872"/>
           </w:tcPr>
           <w:p>
             <w:pPr>
@@ -1597,7 +1737,7 @@
         </w:tc>
         <w:tc>
           <w:tcPr>
-            <w:tcW w:type="dxa" w:w="4820"/>
+            <w:tcW w:type="dxa" w:w="4806"/>
           </w:tcPr>
           <w:p>
             <w:pPr>
@@ -1684,7 +1824,7 @@
         </w:tc>
         <w:tc>
           <w:tcPr>
-            <w:tcW w:type="dxa" w:w="5095"/>
+            <w:tcW w:type="dxa" w:w="5079"/>
           </w:tcPr>
           <w:p>
             <w:pPr>
@@ -1731,7 +1871,7 @@
         </w:tc>
         <w:tc>
           <w:tcPr>
-            <w:tcW w:type="dxa" w:w="2841"/>
+            <w:tcW w:type="dxa" w:w="2872"/>
           </w:tcPr>
           <w:p>
             <w:pPr>
@@ -1744,13 +1884,13 @@
                 <w:color w:val="1A1A1A"/>
                 <w:sz w:val="19"/>
               </w:rPr>
-              <w:t>바네사가 오빠를 부를 때마다 시청자가 방금 본 일을 처음부터 다시 말한다(30자 넘는 줄 4개, 6화 "不仅袭击我，还当众蛊惑人心"까지). 5화 첫 줄은 법정 말투(蓄意阻拦 · 企图刺杀本公主).</w:t>
+              <w:t>바네사가 오빠를 부를 때마다 시청자가 방금 본 일을 처음부터 다시 말한다(30자 넘는 줄 4개, 6화 "不仅袭击我，还当众蛊惑人心"까지). 5화 첫 줄은 재판정 고발문 같은 말투다(蓄意阻拦 · 企图刺杀本公主).</w:t>
             </w:r>
           </w:p>
         </w:tc>
         <w:tc>
           <w:tcPr>
-            <w:tcW w:type="dxa" w:w="4820"/>
+            <w:tcW w:type="dxa" w:w="4806"/>
           </w:tcPr>
           <w:p>
             <w:pPr>
@@ -1837,7 +1977,7 @@
         </w:tc>
         <w:tc>
           <w:tcPr>
-            <w:tcW w:type="dxa" w:w="5095"/>
+            <w:tcW w:type="dxa" w:w="5079"/>
           </w:tcPr>
           <w:p>
             <w:pPr>
@@ -1884,7 +2024,7 @@
         </w:tc>
         <w:tc>
           <w:tcPr>
-            <w:tcW w:type="dxa" w:w="2841"/>
+            <w:tcW w:type="dxa" w:w="2872"/>
           </w:tcPr>
           <w:p>
             <w:pPr>
@@ -1903,7 +2043,7 @@
         </w:tc>
         <w:tc>
           <w:tcPr>
-            <w:tcW w:type="dxa" w:w="4820"/>
+            <w:tcW w:type="dxa" w:w="4806"/>
           </w:tcPr>
           <w:p>
             <w:pPr>
@@ -4331,9 +4471,9 @@
       <w:tblGrid>
         <w:gridCol w:w="454"/>
         <w:gridCol w:w="1814"/>
-        <w:gridCol w:w="4725"/>
-        <w:gridCol w:w="3307"/>
-        <w:gridCol w:w="4725"/>
+        <w:gridCol w:w="4698"/>
+        <w:gridCol w:w="3361"/>
+        <w:gridCol w:w="4698"/>
       </w:tblGrid>
       <w:tr>
         <w:tc>
@@ -4378,7 +4518,7 @@
         </w:tc>
         <w:tc>
           <w:tcPr>
-            <w:tcW w:type="dxa" w:w="4725"/>
+            <w:tcW w:type="dxa" w:w="4698"/>
             <w:shd w:val="clear" w:color="auto" w:fill="EFE6D2"/>
           </w:tcPr>
           <w:p>
@@ -4398,7 +4538,7 @@
         </w:tc>
         <w:tc>
           <w:tcPr>
-            <w:tcW w:type="dxa" w:w="3307"/>
+            <w:tcW w:type="dxa" w:w="3361"/>
             <w:shd w:val="clear" w:color="auto" w:fill="EFE6D2"/>
           </w:tcPr>
           <w:p>
@@ -4418,7 +4558,7 @@
         </w:tc>
         <w:tc>
           <w:tcPr>
-            <w:tcW w:type="dxa" w:w="4725"/>
+            <w:tcW w:type="dxa" w:w="4698"/>
             <w:shd w:val="clear" w:color="auto" w:fill="EFE6D2"/>
           </w:tcPr>
           <w:p>
@@ -4478,7 +4618,7 @@
         </w:tc>
         <w:tc>
           <w:tcPr>
-            <w:tcW w:type="dxa" w:w="4725"/>
+            <w:tcW w:type="dxa" w:w="4698"/>
           </w:tcPr>
           <w:p>
             <w:pPr>
@@ -4539,7 +4679,7 @@
         </w:tc>
         <w:tc>
           <w:tcPr>
-            <w:tcW w:type="dxa" w:w="3307"/>
+            <w:tcW w:type="dxa" w:w="3361"/>
           </w:tcPr>
           <w:p>
             <w:pPr>
@@ -4558,7 +4698,7 @@
         </w:tc>
         <w:tc>
           <w:tcPr>
-            <w:tcW w:type="dxa" w:w="4725"/>
+            <w:tcW w:type="dxa" w:w="4698"/>
           </w:tcPr>
           <w:p>
             <w:pPr>
@@ -4613,7 +4753,7 @@
                 <w:color w:val="1A1A1A"/>
                 <w:sz w:val="19"/>
               </w:rPr>
-              <w:t>20화 결투 중 암살(데미안과 싸우는 자리)과 바로 이어진다.</w:t>
+              <w:t>20화 결투 중 암살(데미안과 싸우는 자리)과 바로 이어진다. "脏水"를 데미안에게 씌운다는 건 20화를 보고 잡은 방향이라, 작가 뜻이 다르면 누구에게 씌우는지만 한마디 넣는다.</w:t>
             </w:r>
           </w:p>
         </w:tc>
@@ -4659,7 +4799,7 @@
         </w:tc>
         <w:tc>
           <w:tcPr>
-            <w:tcW w:type="dxa" w:w="4725"/>
+            <w:tcW w:type="dxa" w:w="4698"/>
           </w:tcPr>
           <w:p>
             <w:pPr>
@@ -4734,7 +4874,7 @@
         </w:tc>
         <w:tc>
           <w:tcPr>
-            <w:tcW w:type="dxa" w:w="3307"/>
+            <w:tcW w:type="dxa" w:w="3361"/>
           </w:tcPr>
           <w:p>
             <w:pPr>
@@ -4747,13 +4887,13 @@
                 <w:color w:val="1A1A1A"/>
                 <w:sz w:val="19"/>
               </w:rPr>
-              <w:t>땅 주인이 누구냐를 두고 법정 변론이 오간다. 올리비아 세 줄 118자, 데미안 49자(이 대본에서 제일 긴 줄)에 같은 뜻 한 줄 더. 세금·사금고·지참금·국경·신성한 영토 — 따라가기 힘든 말이 몰려 있다. 요점은 16화 끝 "把你们霸占了十几年、属于我母亲的陪嫁领地，交出来"(어머니 영지 내놔)로 이미 섰다.</w:t>
+              <w:t>땅 주인이 누구냐를 두고 법정 변론이 오간다. 올리비아는 세 줄 118자, 데미안은 49자 한 줄(이 대본에서 제일 긴 줄)에 같은 뜻 줄을 하나 더 붙인다. 세금·사금고·지참금·국경·신성한 영토 — 따라가기 힘든 말이 몰려 있다. 요점은 16화 끝 "把你们霸占了十几年、属于我母亲的陪嫁领地，交出来"(어머니 영지 내놔)로 이미 나왔다.</w:t>
             </w:r>
           </w:p>
         </w:tc>
         <w:tc>
           <w:tcPr>
-            <w:tcW w:type="dxa" w:w="4725"/>
+            <w:tcW w:type="dxa" w:w="4698"/>
           </w:tcPr>
           <w:p>
             <w:pPr>
@@ -4854,7 +4994,7 @@
         </w:tc>
         <w:tc>
           <w:tcPr>
-            <w:tcW w:type="dxa" w:w="4725"/>
+            <w:tcW w:type="dxa" w:w="4698"/>
           </w:tcPr>
           <w:p>
             <w:pPr>
@@ -4901,7 +5041,7 @@
         </w:tc>
         <w:tc>
           <w:tcPr>
-            <w:tcW w:type="dxa" w:w="3307"/>
+            <w:tcW w:type="dxa" w:w="3361"/>
           </w:tcPr>
           <w:p>
             <w:pPr>
@@ -4920,7 +5060,7 @@
         </w:tc>
         <w:tc>
           <w:tcPr>
-            <w:tcW w:type="dxa" w:w="4725"/>
+            <w:tcW w:type="dxa" w:w="4698"/>
           </w:tcPr>
           <w:p>
             <w:pPr>
@@ -5007,7 +5147,7 @@
         </w:tc>
         <w:tc>
           <w:tcPr>
-            <w:tcW w:type="dxa" w:w="4725"/>
+            <w:tcW w:type="dxa" w:w="4698"/>
           </w:tcPr>
           <w:p>
             <w:pPr>
@@ -5082,7 +5222,7 @@
         </w:tc>
         <w:tc>
           <w:tcPr>
-            <w:tcW w:type="dxa" w:w="3307"/>
+            <w:tcW w:type="dxa" w:w="3361"/>
           </w:tcPr>
           <w:p>
             <w:pPr>
@@ -5101,7 +5241,7 @@
         </w:tc>
         <w:tc>
           <w:tcPr>
-            <w:tcW w:type="dxa" w:w="4725"/>
+            <w:tcW w:type="dxa" w:w="4698"/>
           </w:tcPr>
           <w:p>
             <w:pPr>
@@ -5114,7 +5254,7 @@
                 <w:color w:val="1A1A1A"/>
                 <w:sz w:val="19"/>
               </w:rPr>
-              <w:t>19화 귀족 B 둘째 줄 · 귀족 C 삭제. 다이앤 → 黛安：贱种就是贱种！ (잡것은 잡것이지!) — 제나 줄은 가브리엘 대사를 부르니 남긴다.</w:t>
+              <w:t>19화 귀족 B 둘째 줄 · 귀족 C 삭제. 다이앤 → 黛安：贱种就是贱种！ (잡것은 잡것이지!) — 제나 줄은 바로 뒤 가브리엘 대사가 그 대답이라 남긴다.</w:t>
             </w:r>
           </w:p>
           <w:p>
@@ -5188,7 +5328,7 @@
         </w:tc>
         <w:tc>
           <w:tcPr>
-            <w:tcW w:type="dxa" w:w="4725"/>
+            <w:tcW w:type="dxa" w:w="4698"/>
           </w:tcPr>
           <w:p>
             <w:pPr>
@@ -5235,7 +5375,7 @@
         </w:tc>
         <w:tc>
           <w:tcPr>
-            <w:tcW w:type="dxa" w:w="3307"/>
+            <w:tcW w:type="dxa" w:w="3361"/>
           </w:tcPr>
           <w:p>
             <w:pPr>
@@ -5254,7 +5394,7 @@
         </w:tc>
         <w:tc>
           <w:tcPr>
-            <w:tcW w:type="dxa" w:w="4725"/>
+            <w:tcW w:type="dxa" w:w="4698"/>
           </w:tcPr>
           <w:p>
             <w:pPr>
@@ -5327,7 +5467,7 @@
         </w:tc>
         <w:tc>
           <w:tcPr>
-            <w:tcW w:type="dxa" w:w="4725"/>
+            <w:tcW w:type="dxa" w:w="4698"/>
           </w:tcPr>
           <w:p>
             <w:pPr>
@@ -5388,7 +5528,7 @@
         </w:tc>
         <w:tc>
           <w:tcPr>
-            <w:tcW w:type="dxa" w:w="3307"/>
+            <w:tcW w:type="dxa" w:w="3361"/>
           </w:tcPr>
           <w:p>
             <w:pPr>
@@ -5407,7 +5547,7 @@
         </w:tc>
         <w:tc>
           <w:tcPr>
-            <w:tcW w:type="dxa" w:w="4725"/>
+            <w:tcW w:type="dxa" w:w="4698"/>
           </w:tcPr>
           <w:p>
             <w:pPr>
@@ -5462,7 +5602,7 @@
                 <w:color w:val="1A1A1A"/>
                 <w:sz w:val="19"/>
               </w:rPr>
-              <w:t>16화 → 达米安（VO）：无论如何，我都要守护她。 (무슨 일이 있어도 이 애를 지킬 거야.) — 2-3 오류 13번 "은발 천사"도 같이 풀린다.</w:t>
+              <w:t>16화 → 达米安（VO）：无论如何，我都要守护她。 (무슨 일이 있어도 이 애를 지킬 거야.) — 아래 2-3 오류 표 13번 "은발 천사"도 같이 없어진다.</w:t>
             </w:r>
           </w:p>
         </w:tc>
@@ -6124,9 +6264,9 @@
       <w:tblGrid>
         <w:gridCol w:w="454"/>
         <w:gridCol w:w="1814"/>
-        <w:gridCol w:w="3884"/>
-        <w:gridCol w:w="5467"/>
-        <w:gridCol w:w="3405"/>
+        <w:gridCol w:w="3820"/>
+        <w:gridCol w:w="5588"/>
+        <w:gridCol w:w="3348"/>
       </w:tblGrid>
       <w:tr>
         <w:tc>
@@ -6171,7 +6311,7 @@
         </w:tc>
         <w:tc>
           <w:tcPr>
-            <w:tcW w:type="dxa" w:w="3884"/>
+            <w:tcW w:type="dxa" w:w="3820"/>
             <w:shd w:val="clear" w:color="auto" w:fill="EFE6D2"/>
           </w:tcPr>
           <w:p>
@@ -6191,7 +6331,7 @@
         </w:tc>
         <w:tc>
           <w:tcPr>
-            <w:tcW w:type="dxa" w:w="5467"/>
+            <w:tcW w:type="dxa" w:w="5588"/>
             <w:shd w:val="clear" w:color="auto" w:fill="EFE6D2"/>
           </w:tcPr>
           <w:p>
@@ -6211,7 +6351,7 @@
         </w:tc>
         <w:tc>
           <w:tcPr>
-            <w:tcW w:type="dxa" w:w="3405"/>
+            <w:tcW w:type="dxa" w:w="3348"/>
             <w:shd w:val="clear" w:color="auto" w:fill="EFE6D2"/>
           </w:tcPr>
           <w:p>
@@ -6271,7 +6411,7 @@
         </w:tc>
         <w:tc>
           <w:tcPr>
-            <w:tcW w:type="dxa" w:w="3884"/>
+            <w:tcW w:type="dxa" w:w="3820"/>
           </w:tcPr>
           <w:p>
             <w:pPr>
@@ -6304,7 +6444,7 @@
         </w:tc>
         <w:tc>
           <w:tcPr>
-            <w:tcW w:type="dxa" w:w="5467"/>
+            <w:tcW w:type="dxa" w:w="5588"/>
           </w:tcPr>
           <w:p>
             <w:pPr>
@@ -6323,7 +6463,7 @@
         </w:tc>
         <w:tc>
           <w:tcPr>
-            <w:tcW w:type="dxa" w:w="3405"/>
+            <w:tcW w:type="dxa" w:w="3348"/>
           </w:tcPr>
           <w:p>
             <w:pPr>
@@ -6382,7 +6522,7 @@
         </w:tc>
         <w:tc>
           <w:tcPr>
-            <w:tcW w:type="dxa" w:w="3884"/>
+            <w:tcW w:type="dxa" w:w="3820"/>
           </w:tcPr>
           <w:p>
             <w:pPr>
@@ -6401,7 +6541,7 @@
         </w:tc>
         <w:tc>
           <w:tcPr>
-            <w:tcW w:type="dxa" w:w="5467"/>
+            <w:tcW w:type="dxa" w:w="5588"/>
           </w:tcPr>
           <w:p>
             <w:pPr>
@@ -6414,7 +6554,7 @@
                 <w:color w:val="1A1A1A"/>
                 <w:sz w:val="19"/>
               </w:rPr>
-              <w:t>"고통이 전부 넘어온다"는 규칙이 결속이 살아 있는 다른 장면에서 안 먹는다.</w:t>
+              <w:t>"고통이 전부 넘어온다"는 규칙이 결속이 살아 있는 다른 장면에서 작동하지 않는다.</w:t>
             </w:r>
           </w:p>
           <w:p>
@@ -6442,13 +6582,13 @@
                 <w:color w:val="1A1A1A"/>
                 <w:sz w:val="19"/>
               </w:rPr>
-              <w:t>데미안은 어디서도 안 아프다. 9화는 8화 바로 다음 순간이라 바로 걸린다.</w:t>
+              <w:t>데미안은 어디서도 안 아프다. 9화는 8화 바로 다음 순간이라 시청자가 바로 알아챈다.</w:t>
             </w:r>
           </w:p>
         </w:tc>
         <w:tc>
           <w:tcPr>
-            <w:tcW w:type="dxa" w:w="3405"/>
+            <w:tcW w:type="dxa" w:w="3348"/>
           </w:tcPr>
           <w:p>
             <w:pPr>
@@ -6521,7 +6661,7 @@
         </w:tc>
         <w:tc>
           <w:tcPr>
-            <w:tcW w:type="dxa" w:w="3884"/>
+            <w:tcW w:type="dxa" w:w="3820"/>
           </w:tcPr>
           <w:p>
             <w:pPr>
@@ -6540,7 +6680,7 @@
         </w:tc>
         <w:tc>
           <w:tcPr>
-            <w:tcW w:type="dxa" w:w="5467"/>
+            <w:tcW w:type="dxa" w:w="5588"/>
           </w:tcPr>
           <w:p>
             <w:pPr>
@@ -6559,7 +6699,7 @@
         </w:tc>
         <w:tc>
           <w:tcPr>
-            <w:tcW w:type="dxa" w:w="3405"/>
+            <w:tcW w:type="dxa" w:w="3348"/>
           </w:tcPr>
           <w:p>
             <w:pPr>
@@ -6618,7 +6758,7 @@
         </w:tc>
         <w:tc>
           <w:tcPr>
-            <w:tcW w:type="dxa" w:w="3884"/>
+            <w:tcW w:type="dxa" w:w="3820"/>
           </w:tcPr>
           <w:p>
             <w:pPr>
@@ -6651,7 +6791,7 @@
         </w:tc>
         <w:tc>
           <w:tcPr>
-            <w:tcW w:type="dxa" w:w="5467"/>
+            <w:tcW w:type="dxa" w:w="5588"/>
           </w:tcPr>
           <w:p>
             <w:pPr>
@@ -6670,7 +6810,7 @@
         </w:tc>
         <w:tc>
           <w:tcPr>
-            <w:tcW w:type="dxa" w:w="3405"/>
+            <w:tcW w:type="dxa" w:w="3348"/>
           </w:tcPr>
           <w:p>
             <w:pPr>
@@ -6729,7 +6869,7 @@
         </w:tc>
         <w:tc>
           <w:tcPr>
-            <w:tcW w:type="dxa" w:w="3884"/>
+            <w:tcW w:type="dxa" w:w="3820"/>
           </w:tcPr>
           <w:p>
             <w:pPr>
@@ -6762,7 +6902,7 @@
         </w:tc>
         <w:tc>
           <w:tcPr>
-            <w:tcW w:type="dxa" w:w="5467"/>
+            <w:tcW w:type="dxa" w:w="5588"/>
           </w:tcPr>
           <w:p>
             <w:pPr>
@@ -6781,7 +6921,7 @@
         </w:tc>
         <w:tc>
           <w:tcPr>
-            <w:tcW w:type="dxa" w:w="3405"/>
+            <w:tcW w:type="dxa" w:w="3348"/>
           </w:tcPr>
           <w:p>
             <w:pPr>
@@ -6840,7 +6980,7 @@
         </w:tc>
         <w:tc>
           <w:tcPr>
-            <w:tcW w:type="dxa" w:w="3884"/>
+            <w:tcW w:type="dxa" w:w="3820"/>
           </w:tcPr>
           <w:p>
             <w:pPr>
@@ -6873,7 +7013,7 @@
         </w:tc>
         <w:tc>
           <w:tcPr>
-            <w:tcW w:type="dxa" w:w="5467"/>
+            <w:tcW w:type="dxa" w:w="5588"/>
           </w:tcPr>
           <w:p>
             <w:pPr>
@@ -6892,7 +7032,7 @@
         </w:tc>
         <w:tc>
           <w:tcPr>
-            <w:tcW w:type="dxa" w:w="3405"/>
+            <w:tcW w:type="dxa" w:w="3348"/>
           </w:tcPr>
           <w:p>
             <w:pPr>
@@ -6951,7 +7091,7 @@
         </w:tc>
         <w:tc>
           <w:tcPr>
-            <w:tcW w:type="dxa" w:w="3884"/>
+            <w:tcW w:type="dxa" w:w="3820"/>
           </w:tcPr>
           <w:p>
             <w:pPr>
@@ -6970,7 +7110,7 @@
         </w:tc>
         <w:tc>
           <w:tcPr>
-            <w:tcW w:type="dxa" w:w="5467"/>
+            <w:tcW w:type="dxa" w:w="5588"/>
           </w:tcPr>
           <w:p>
             <w:pPr>
@@ -6989,7 +7129,7 @@
         </w:tc>
         <w:tc>
           <w:tcPr>
-            <w:tcW w:type="dxa" w:w="3405"/>
+            <w:tcW w:type="dxa" w:w="3348"/>
           </w:tcPr>
           <w:p>
             <w:pPr>
@@ -7048,7 +7188,7 @@
         </w:tc>
         <w:tc>
           <w:tcPr>
-            <w:tcW w:type="dxa" w:w="3884"/>
+            <w:tcW w:type="dxa" w:w="3820"/>
           </w:tcPr>
           <w:p>
             <w:pPr>
@@ -7081,7 +7221,7 @@
         </w:tc>
         <w:tc>
           <w:tcPr>
-            <w:tcW w:type="dxa" w:w="5467"/>
+            <w:tcW w:type="dxa" w:w="5588"/>
           </w:tcPr>
           <w:p>
             <w:pPr>
@@ -7094,13 +7234,13 @@
                 <w:color w:val="1A1A1A"/>
                 <w:sz w:val="19"/>
               </w:rPr>
-              <w:t>짧은 검은 앞에서 "精准打落刺客的武器"(정확히 쳐서 떨어뜨림)로 떨어졌고, 암살자는 "从腰后拔出匕首"(허리 뒤에서 단검을 새로 뽑음). 클로즈업이라 무기 모양이 그대로 보인다.</w:t>
+              <w:t>짧은 검(短剑)은 앞에서 "精准打落刺客的武器"(정확히 쳐서 떨어뜨림)로 떨어졌고, 암살자는 "从腰后拔出匕首"(허리 뒤에서 단검을 새로 뽑음). 클로즈업이라 무기 모양이 그대로 보인다.</w:t>
             </w:r>
           </w:p>
         </w:tc>
         <w:tc>
           <w:tcPr>
-            <w:tcW w:type="dxa" w:w="3405"/>
+            <w:tcW w:type="dxa" w:w="3348"/>
           </w:tcPr>
           <w:p>
             <w:pPr>
@@ -7159,7 +7299,7 @@
         </w:tc>
         <w:tc>
           <w:tcPr>
-            <w:tcW w:type="dxa" w:w="3884"/>
+            <w:tcW w:type="dxa" w:w="3820"/>
           </w:tcPr>
           <w:p>
             <w:pPr>
@@ -7178,7 +7318,7 @@
         </w:tc>
         <w:tc>
           <w:tcPr>
-            <w:tcW w:type="dxa" w:w="5467"/>
+            <w:tcW w:type="dxa" w:w="5588"/>
           </w:tcPr>
           <w:p>
             <w:pPr>
@@ -7197,7 +7337,7 @@
         </w:tc>
         <w:tc>
           <w:tcPr>
-            <w:tcW w:type="dxa" w:w="3405"/>
+            <w:tcW w:type="dxa" w:w="3348"/>
           </w:tcPr>
           <w:p>
             <w:pPr>
@@ -7256,7 +7396,7 @@
         </w:tc>
         <w:tc>
           <w:tcPr>
-            <w:tcW w:type="dxa" w:w="3884"/>
+            <w:tcW w:type="dxa" w:w="3820"/>
           </w:tcPr>
           <w:p>
             <w:pPr>
@@ -7275,7 +7415,7 @@
         </w:tc>
         <w:tc>
           <w:tcPr>
-            <w:tcW w:type="dxa" w:w="5467"/>
+            <w:tcW w:type="dxa" w:w="5588"/>
           </w:tcPr>
           <w:p>
             <w:pPr>
@@ -7294,7 +7434,7 @@
         </w:tc>
         <w:tc>
           <w:tcPr>
-            <w:tcW w:type="dxa" w:w="3405"/>
+            <w:tcW w:type="dxa" w:w="3348"/>
           </w:tcPr>
           <w:p>
             <w:pPr>
@@ -7353,7 +7493,7 @@
         </w:tc>
         <w:tc>
           <w:tcPr>
-            <w:tcW w:type="dxa" w:w="3884"/>
+            <w:tcW w:type="dxa" w:w="3820"/>
           </w:tcPr>
           <w:p>
             <w:pPr>
@@ -7386,7 +7526,7 @@
         </w:tc>
         <w:tc>
           <w:tcPr>
-            <w:tcW w:type="dxa" w:w="5467"/>
+            <w:tcW w:type="dxa" w:w="5588"/>
           </w:tcPr>
           <w:p>
             <w:pPr>
@@ -7405,7 +7545,7 @@
         </w:tc>
         <w:tc>
           <w:tcPr>
-            <w:tcW w:type="dxa" w:w="3405"/>
+            <w:tcW w:type="dxa" w:w="3348"/>
           </w:tcPr>
           <w:p>
             <w:pPr>
@@ -7464,7 +7604,7 @@
         </w:tc>
         <w:tc>
           <w:tcPr>
-            <w:tcW w:type="dxa" w:w="3884"/>
+            <w:tcW w:type="dxa" w:w="3820"/>
           </w:tcPr>
           <w:p>
             <w:pPr>
@@ -7483,7 +7623,7 @@
         </w:tc>
         <w:tc>
           <w:tcPr>
-            <w:tcW w:type="dxa" w:w="5467"/>
+            <w:tcW w:type="dxa" w:w="5588"/>
           </w:tcPr>
           <w:p>
             <w:pPr>
@@ -7502,7 +7642,7 @@
         </w:tc>
         <w:tc>
           <w:tcPr>
-            <w:tcW w:type="dxa" w:w="3405"/>
+            <w:tcW w:type="dxa" w:w="3348"/>
           </w:tcPr>
           <w:p>
             <w:pPr>
@@ -7561,7 +7701,7 @@
         </w:tc>
         <w:tc>
           <w:tcPr>
-            <w:tcW w:type="dxa" w:w="3884"/>
+            <w:tcW w:type="dxa" w:w="3820"/>
           </w:tcPr>
           <w:p>
             <w:pPr>
@@ -7580,7 +7720,7 @@
         </w:tc>
         <w:tc>
           <w:tcPr>
-            <w:tcW w:type="dxa" w:w="5467"/>
+            <w:tcW w:type="dxa" w:w="5588"/>
           </w:tcPr>
           <w:p>
             <w:pPr>
@@ -7593,13 +7733,13 @@
                 <w:color w:val="1A1A1A"/>
                 <w:sz w:val="19"/>
               </w:rPr>
-              <w:t>소녀 머리색은 줄곧 백금(铂金)이다(같은 줄 앞 "这抹纯粹的铂金色", 3·16화 "铂金发女孩"). 소리로 들으면 다른 색이 된다. "Silver Angel"은 원작 제목의 말이기도 하다.</w:t>
+              <w:t>소녀 머리색은 줄곧 백금(铂金)이다(같은 줄 앞 "这抹纯粹的铂金色", 3·16화 "铂金发女孩"). 소리로 들으면 다른 색이 된다. "은발 천사(Silver Angel)"는 원작 제목에 쓰인 말이라 원작 흔적이 남는다.</w:t>
             </w:r>
           </w:p>
         </w:tc>
         <w:tc>
           <w:tcPr>
-            <w:tcW w:type="dxa" w:w="3405"/>
+            <w:tcW w:type="dxa" w:w="3348"/>
           </w:tcPr>
           <w:p>
             <w:pPr>
@@ -7612,7 +7752,7 @@
                 <w:color w:val="1A1A1A"/>
                 <w:sz w:val="19"/>
               </w:rPr>
-              <w:t>我都要守护我的铂金发女孩 (내 백금발 소녀를 지킬 거야) — 2-1 대사 6번대로 줄이면 같이 없어진다.</w:t>
+              <w:t>我都要守护我的铂金发女孩 (내 백금발 소녀를 지킬 거야) — 위 2-1 대사 표 6번대로 줄이면 같이 없어진다.</w:t>
             </w:r>
           </w:p>
         </w:tc>
@@ -7658,7 +7798,7 @@
         </w:tc>
         <w:tc>
           <w:tcPr>
-            <w:tcW w:type="dxa" w:w="3884"/>
+            <w:tcW w:type="dxa" w:w="3820"/>
           </w:tcPr>
           <w:p>
             <w:pPr>
@@ -7691,7 +7831,7 @@
         </w:tc>
         <w:tc>
           <w:tcPr>
-            <w:tcW w:type="dxa" w:w="5467"/>
+            <w:tcW w:type="dxa" w:w="5588"/>
           </w:tcPr>
           <w:p>
             <w:pPr>
@@ -7710,7 +7850,7 @@
         </w:tc>
         <w:tc>
           <w:tcPr>
-            <w:tcW w:type="dxa" w:w="3405"/>
+            <w:tcW w:type="dxa" w:w="3348"/>
           </w:tcPr>
           <w:p>
             <w:pPr>
@@ -7769,7 +7909,7 @@
         </w:tc>
         <w:tc>
           <w:tcPr>
-            <w:tcW w:type="dxa" w:w="3884"/>
+            <w:tcW w:type="dxa" w:w="3820"/>
           </w:tcPr>
           <w:p>
             <w:pPr>
@@ -7858,7 +7998,7 @@
         </w:tc>
         <w:tc>
           <w:tcPr>
-            <w:tcW w:type="dxa" w:w="5467"/>
+            <w:tcW w:type="dxa" w:w="5588"/>
           </w:tcPr>
           <w:p>
             <w:pPr>
@@ -7947,7 +8087,7 @@
         </w:tc>
         <w:tc>
           <w:tcPr>
-            <w:tcW w:type="dxa" w:w="3405"/>
+            <w:tcW w:type="dxa" w:w="3348"/>
           </w:tcPr>
           <w:p>
             <w:pPr>

</xml_diff>